<commit_message>
docs: citation audit + EPIC Figure 1 regeneration (attribution and provenance only, no results change)
</commit_message>
<xml_diff>
--- a/docs/Technical_Appendix_Cascade_Derivation.docx
+++ b/docs/Technical_Appendix_Cascade_Derivation.docx
@@ -123,7 +123,18 @@
         <w:pStyle w:val="BodyText"/>
       </w:pPr>
       <w:r>
-        <w:t>where FLEX_FRAC = 0.25, the DVFS flexibility fraction measured by Colangelo et al. (Nature Energy, 2025) at the GPU cluster level via nvidia-smi.</w:t>
+        <w:t xml:space="preserve">where </w:t>
+      </w:r>
+      <w:r>
+        <w:t>FLEX_FRAC = 0.25 is adopted as a conservative ceiling for the aggregate software-orchestrated flexibility fraction at the GPU cluster level, consistent with the 25% power reduction sustained for three hours on a 256-GPU cluster in Phoenix by Colangelo et al. (Nat Energy, 2026). The demonstrated reduction was achieved via a combination of control knobs — DVFS (</w:t>
+      </w:r>
+      <w:proofErr w:type="spellStart"/>
+      <w:r>
+        <w:t>nvidia-smi</w:t>
+      </w:r>
+      <w:proofErr w:type="spellEnd"/>
+      <w:r>
+        <w:t xml:space="preserve"> power capping), job pausing, and GPU resource reallocation — rather than DVFS alone, and is a utility-set target, not a measured physical ceiling of any single technique.</w:t>
       </w:r>
     </w:p>
     <w:p>
@@ -258,19 +269,32 @@
         <w:pStyle w:val="BlockText"/>
       </w:pPr>
       <w:r>
+        <w:lastRenderedPageBreak/>
         <w:t>Commitment Depth = Spatial + FLEX_FRAC × (S1 − Spatial)</w:t>
       </w:r>
     </w:p>
     <w:p>
       <w:pPr>
-        <w:pStyle w:val="FirstParagraph"/>
-      </w:pPr>
-      <w:r>
-        <w:t xml:space="preserve">This is a correction to the earlier formulation (Spatial + DVFS × (1 − Spatial)), which incorrectly applied DVFS to the entire non-migrating facility load including cooling, power conditioning, and non-compute infrastructure. Colangelo et al. measured DVFS power </w:t>
-      </w:r>
-      <w:r>
-        <w:lastRenderedPageBreak/>
-        <w:t>reduction at the GPU cluster level via nvidia-smi, not at the facility meter. DVFS cannot reduce cooling or infrastructure load. The corrected formula restricts the DVFS base to the S1 fraction of facility load that is running compute workloads.</w:t>
+        <w:pStyle w:val="BodyText"/>
+      </w:pPr>
+      <w:r>
+        <w:t xml:space="preserve">This is a correction to the earlier formulation (Spatial + DVFS × (1 − Spatial)), which incorrectly applied DVFS to the entire non-migrating facility load including cooling, power conditioning, and non-compute infrastructure. The Colangelo et al. field demonstration measured the combined power reduction at the GPU cluster level via </w:t>
+      </w:r>
+      <w:proofErr w:type="spellStart"/>
+      <w:r>
+        <w:t>nvidia-smi</w:t>
+      </w:r>
+      <w:proofErr w:type="spellEnd"/>
+      <w:r>
+        <w:t xml:space="preserve"> and workload orchestration, not at the facility meter. Neither DVFS nor pausing nor resource reallocation can reduce cooling or infrastructure load. The corrected formula restricts the flexibility base to the S1 fraction of facility load that is running </w:t>
+      </w:r>
+      <w:proofErr w:type="gramStart"/>
+      <w:r>
+        <w:t>compute</w:t>
+      </w:r>
+      <w:proofErr w:type="gramEnd"/>
+      <w:r>
+        <w:t xml:space="preserve"> workloads.</w:t>
       </w:r>
     </w:p>
     <w:p>
@@ -609,6 +633,7 @@
         <w:pStyle w:val="FirstParagraph"/>
       </w:pPr>
       <w:r>
+        <w:lastRenderedPageBreak/>
         <w:t xml:space="preserve">S1 answers: </w:t>
       </w:r>
       <w:r>
@@ -665,7 +690,6 @@
           <w:i/>
           <w:iCs/>
         </w:rPr>
-        <w:lastRenderedPageBreak/>
         <w:t>AI-Era Workload Composition</w:t>
       </w:r>
     </w:p>
@@ -1048,7 +1072,30 @@
         <w:pStyle w:val="BodyText"/>
       </w:pPr>
       <w:r>
-        <w:t>Key evidence: - McKinsey (December 2025) characterizes inference as “highly atomizable — individual tasks can be handled independently — unlike training, which relies on large-scale, tightly synchronized GPU clusters.” - Splitwise (Patel et al., ISCA 2024) demonstrates that even within a single inference request, prompt and decode phases can be split across different machines with KV-cache transfer, implying inter-facility request routing is architecturally trivial compared to intra-request splitting. - SageServe (Jia et al., 2025) production O365 traces show strong diurnal periodicity (ρ ≈ 0.95) for interactive foreground inference, confirming load is predictable and schedulable. - DynamoLLM (Stojkovic et al., HPCA 2025) demonstrates inference clusters have significant load variation, with periods of low utilization where DVFS plus scale-in saves 53% energy.</w:t>
+        <w:t xml:space="preserve">Key evidence: - McKinsey (December 2025) characterizes inference as “highly atomizable — individual tasks can be handled independently — unlike training, which relies on large-scale, tightly synchronized GPU clusters.” - Splitwise (Patel et al., ISCA 2024) demonstrates that even within a single inference request, prompt and decode phases can be split across different machines with KV-cache transfer, implying inter-facility request routing is architecturally trivial compared to intra-request splitting. - </w:t>
+      </w:r>
+      <w:proofErr w:type="spellStart"/>
+      <w:r>
+        <w:t>SageServe</w:t>
+      </w:r>
+      <w:proofErr w:type="spellEnd"/>
+      <w:r>
+        <w:t xml:space="preserve"> (Jaiswal et al., 2025) production O365 traces show strong diurnal periodicity (ρ ≈ 0.95) for interactive foreground inference, confirming load is predictable and schedulable</w:t>
+      </w:r>
+      <w:r>
+        <w:t xml:space="preserve">. - </w:t>
+      </w:r>
+      <w:proofErr w:type="spellStart"/>
+      <w:r>
+        <w:t>DynamoLLM</w:t>
+      </w:r>
+      <w:proofErr w:type="spellEnd"/>
+      <w:r>
+        <w:t xml:space="preserve"> (Stojkovic et al., HPCA 2025) demonstrates inference clusters have significant load </w:t>
+      </w:r>
+      <w:r>
+        <w:lastRenderedPageBreak/>
+        <w:t xml:space="preserve">variation, with periods of low utilization where joint control of GPU frequency, model parallelism, and instance count achieves 52% energy savings at the service level. </w:t>
       </w:r>
     </w:p>
     <w:p>
@@ -1072,11 +1119,7 @@
         <w:pStyle w:val="BodyText"/>
       </w:pPr>
       <w:r>
-        <w:t xml:space="preserve">DVFS amenability for inference is high: - Patel et al. (ASPLOS 2024) measured approximately 21% power headroom at the cluster level in Azure production inference </w:t>
-      </w:r>
-      <w:r>
-        <w:lastRenderedPageBreak/>
-        <w:t>clusters due to statistical multiplexing. - Kakolyris et al. (IEEE CAL, 2024) achieved 22.8–45.5% energy savings under SLO constraints for inference serving through iteration-level GPU DVFS.</w:t>
+        <w:t>DVFS amenability for inference is high: - Patel et al. (ASPLOS 2024) measured approximately 21% power headroom at the cluster level in Azure production inference clusters due to statistical multiplexing. - Kakolyris et al. (IEEE CAL, 2024) achieved 22.8–45.5% energy savings under SLO constraints for inference serving through iteration-level GPU DVFS.</w:t>
       </w:r>
     </w:p>
     <w:p>
@@ -1153,14 +1196,14 @@
     </w:p>
     <w:p>
       <w:pPr>
-        <w:pStyle w:val="Compact"/>
+        <w:pStyle w:val="BodyText"/>
         <w:numPr>
           <w:ilvl w:val="0"/>
           <w:numId w:val="4"/>
         </w:numPr>
       </w:pPr>
       <w:r>
-        <w:t>Zhang &amp; Chien show a [0.4, 1.0] dynamic range achievable with intelligent scheduling but with goodput degradation. The upper bound of 0.50 reflects that achieving 60% dynamic range requires sophisticated scheduling with 24-hour foresight and produces 40–60% goodput loss; typical operations without such scheduling are closer to 0.30–0.40.</w:t>
+        <w:t xml:space="preserve">Zhang (Chien advisor, UChicago 2022) characterizes capacity-variable scheduling as capable of absorbing substantial runtime variation, with empirically observed goodput decreases of up to 60% and 15–40% job failure rates under aggressive variability. The upper bound of 0.50 reflects that sophisticated scheduling with 24-hour foresight is required to achieve meaningful dynamic range without unacceptable goodput loss; typical operations without such scheduling are closer to 0.30–0.40. </w:t>
       </w:r>
     </w:p>
     <w:p>
@@ -1180,6 +1223,7 @@
         <w:pStyle w:val="BodyText"/>
       </w:pPr>
       <w:r>
+        <w:lastRenderedPageBreak/>
         <w:t>Smaller scale than pre-training (typically single-node or few-node). Checkpoints are smaller, enabling faster migration. Can be paused and resumed more readily. Non-real-time, not user-facing. High temporal flexibility (0.70–0.90). The 0.30–0.50 range is the author’s estimate based on these architectural characteristics; no production measurement of fine-tuning spatial migration is available in the cited literature.</w:t>
       </w:r>
     </w:p>
@@ -1213,7 +1257,6 @@
         <w:pStyle w:val="BodyText"/>
       </w:pPr>
       <w:r>
-        <w:lastRenderedPageBreak/>
         <w:t>S1 is a scenario construction, not a stochastic variable: within the inference-dominant archetype, S1 does not carry a range. The value is a modeling assumption informed by industry projections, not a published benchmark. The conceptual basis for distinct facility archetypes is well-supported by McKinsey, Uptime Institute, and Deloitte analyses of diverging infrastructure requirements, but no published source provides exact inference-share coefficients by facility type.</w:t>
       </w:r>
     </w:p>
@@ -1236,18 +1279,40 @@
     </w:p>
     <w:p>
       <w:pPr>
-        <w:pStyle w:val="FirstParagraph"/>
-      </w:pPr>
-      <w:r>
-        <w:t>To ground the inference flexibility profile in production data, we analyzed the DynamoLLM dataset (Stojkovic et al., HPCA 2025): 44.1 million production LLM inference requests across two Azure services, collected May 10–18, 2024. The dataset includes per-request timestamps, context tokens, generated tokens, and time-to-</w:t>
+        <w:pStyle w:val="BodyText"/>
+      </w:pPr>
+      <w:r>
+        <w:t xml:space="preserve">To ground the inference flexibility profile in production data, we analyzed 44.1 million production LLM inference requests across two Azure services (Coding and Conversation) from the </w:t>
+      </w:r>
+      <w:proofErr w:type="spellStart"/>
+      <w:r>
+        <w:t>DynamoLLM</w:t>
+      </w:r>
+      <w:proofErr w:type="spellEnd"/>
+      <w:r>
+        <w:t xml:space="preserve"> trace release on the Azure Public Dataset </w:t>
       </w:r>
       <w:proofErr w:type="gramStart"/>
       <w:r>
+        <w:t>repository.[</w:t>
+      </w:r>
+      <w:proofErr w:type="gramEnd"/>
+      <w:r>
+        <w:t>^a] The underlying traces were characterized for energy-management purposes by Stojkovic et al. (HPCA 2025). Our analysis aggregates the released per-request timestamps, context tokens, generated tokens, and time-to-</w:t>
+      </w:r>
+      <w:proofErr w:type="gramStart"/>
+      <w:r>
         <w:t>first-token</w:t>
       </w:r>
       <w:proofErr w:type="gramEnd"/>
       <w:r>
-        <w:t xml:space="preserve"> for two distinct service traces (Coding and Conversation).</w:t>
+        <w:t xml:space="preserve"> to hourly resolution across both services.</w:t>
+      </w:r>
+      <w:r>
+        <w:rPr>
+          <w:rStyle w:val="FootnoteReference"/>
+        </w:rPr>
+        <w:footnoteReference w:id="1"/>
       </w:r>
     </w:p>
     <w:p>
@@ -1291,7 +1356,11 @@
         <w:t>Drain time:</w:t>
       </w:r>
       <w:r>
-        <w:t xml:space="preserve"> P99 generated token counts imply drain times of 4.5–11.6 seconds at typical throughput (60 tok/s per GPU), spanning Coding (4.5 s) and Conversation (11.6 s) services. At optimistic throughput (100 tok/s), drain times compress to 2.7–7.0 seconds. Even at the P99.9 level, individual requests complete well within one minute. This confirms that for inference, the “migration” operation completes in seconds to tens of seconds, not minutes.</w:t>
+        <w:t xml:space="preserve"> P99 generated token counts imply drain times of 4.5–11.6 seconds at typical throughput (60 tok/s per GPU), spanning Coding (4.5 s) and Conversation (11.6 s) services. At optimistic throughput (100 tok/s), drain times compress to 2.7–7.0 seconds. Even at the P99.9 level, individual requests complete well within one </w:t>
+      </w:r>
+      <w:r>
+        <w:lastRenderedPageBreak/>
+        <w:t>minute. This confirms that for inference, the “migration” operation completes in seconds to tens of seconds, not minutes.</w:t>
       </w:r>
     </w:p>
     <w:p>
@@ -1333,7 +1402,7 @@
     <w:p>
       <w:r>
         <w:pict w14:anchorId="509F91A6">
-          <v:rect id="_x0000_i1785" style="width:0;height:1.5pt" o:hralign="center" o:hrstd="t" o:hr="t"/>
+          <v:rect id="_x0000_i1025" style="width:0;height:1.5pt" o:hralign="center" o:hrstd="t" o:hr="t"/>
         </w:pict>
       </w:r>
     </w:p>
@@ -1380,7 +1449,6 @@
               <w:pStyle w:val="Compact"/>
             </w:pPr>
             <w:r>
-              <w:lastRenderedPageBreak/>
               <w:t>Attribute</w:t>
             </w:r>
           </w:p>
@@ -1622,6 +1690,7 @@
         </w:numPr>
       </w:pPr>
       <w:r>
+        <w:lastRenderedPageBreak/>
         <w:t>GDPR Article 44–49 restricts transfer of personal data outside the EEA unless adequacy decisions or approved safeguards apply. Inference workloads processing EU personal data cannot migrate to a US facility without explicit legal basis.</w:t>
       </w:r>
     </w:p>
@@ -1686,11 +1755,7 @@
         <w:pStyle w:val="BodyText"/>
       </w:pPr>
       <w:r>
-        <w:t>A fraction of inference traffic has latency requirements tight enough (sub-10ms round-trip) that geographic distance precludes cross-interconnection routing. This primarily affects: - Real-time interactive applications (gaming inference, high-frequency trading co-</w:t>
-      </w:r>
-      <w:r>
-        <w:lastRenderedPageBreak/>
-        <w:t>processing, real-time robotics control) - Edge-deployed inference with hard latency budgets</w:t>
+        <w:t>A fraction of inference traffic has latency requirements tight enough (sub-10ms round-trip) that geographic distance precludes cross-interconnection routing. This primarily affects: - Real-time interactive applications (gaming inference, high-frequency trading co-processing, real-time robotics control) - Edge-deployed inference with hard latency budgets</w:t>
       </w:r>
     </w:p>
     <w:p>
@@ -1838,7 +1903,40 @@
         <w:pStyle w:val="FirstParagraph"/>
       </w:pPr>
       <w:r>
+        <w:lastRenderedPageBreak/>
         <w:t>No published study directly measures the fraction of inference workloads with geographic constraints. Indirect evidence supports the central estimate:</w:t>
+      </w:r>
+    </w:p>
+    <w:p>
+      <w:pPr>
+        <w:pStyle w:val="BodyText"/>
+      </w:pPr>
+      <w:r>
+        <w:rPr>
+          <w:b/>
+          <w:bCs/>
+        </w:rPr>
+        <w:t>Google</w:t>
+      </w:r>
+      <w:r>
+        <w:rPr>
+          <w:b/>
+          <w:bCs/>
+        </w:rPr>
+        <w:t xml:space="preserve"> </w:t>
+      </w:r>
+      <w:r>
+        <w:t xml:space="preserve">actively shifts “moveable compute tasks” across data centers for carbon-free energy optimization (Radovanović et al., </w:t>
+      </w:r>
+      <w:r>
+        <w:rPr>
+          <w:i/>
+          <w:iCs/>
+        </w:rPr>
+        <w:t>IEEE Transactions on Power Systems</w:t>
+      </w:r>
+      <w:r>
+        <w:t xml:space="preserve"> 38(2), 2023), implying a significant fraction of compute is geographically flexible.</w:t>
       </w:r>
     </w:p>
     <w:p>
@@ -1854,10 +1952,10 @@
           <w:b/>
           <w:bCs/>
         </w:rPr>
-        <w:t>Google</w:t>
-      </w:r>
-      <w:r>
-        <w:t xml:space="preserve"> actively shifts “moveable compute tasks” across data centers for carbon-free energy optimization (Radovanović et al., IEEE TPWRS 38(2), 2022), implying a significant fraction of compute is geographically flexible.</w:t>
+        <w:t>Amazon Bedrock</w:t>
+      </w:r>
+      <w:r>
+        <w:t xml:space="preserve"> routes inference requests across regions automatically via cross-region inference profiles, demonstrating production-grade cross-region inference is architecturally ready.</w:t>
       </w:r>
     </w:p>
     <w:p>
@@ -1873,40 +1971,21 @@
           <w:b/>
           <w:bCs/>
         </w:rPr>
-        <w:t>Amazon Bedrock</w:t>
-      </w:r>
-      <w:r>
-        <w:t xml:space="preserve"> routes inference requests across regions automatically via cross-region inference profiles, demonstrating production-grade cross-region inference is architecturally ready.</w:t>
-      </w:r>
-    </w:p>
-    <w:p>
-      <w:pPr>
-        <w:pStyle w:val="Compact"/>
-        <w:numPr>
-          <w:ilvl w:val="0"/>
-          <w:numId w:val="8"/>
-        </w:numPr>
+        <w:t>SkyLB</w:t>
+      </w:r>
+      <w:r>
+        <w:t xml:space="preserve"> (arXiv:2505.24095, 2025) demonstrates production-grade locality-aware cross-region load balancing for LLM inference.</w:t>
+      </w:r>
+    </w:p>
+    <w:p>
+      <w:pPr>
+        <w:pStyle w:val="FirstParagraph"/>
       </w:pPr>
       <w:r>
         <w:rPr>
           <w:b/>
           <w:bCs/>
         </w:rPr>
-        <w:t>SkyLB</w:t>
-      </w:r>
-      <w:r>
-        <w:t xml:space="preserve"> (arXiv:2505.24095, 2025) demonstrates production-grade locality-aware cross-region load balancing for LLM inference.</w:t>
-      </w:r>
-    </w:p>
-    <w:p>
-      <w:pPr>
-        <w:pStyle w:val="FirstParagraph"/>
-      </w:pPr>
-      <w:r>
-        <w:rPr>
-          <w:b/>
-          <w:bCs/>
-        </w:rPr>
         <w:t>S2 is the parameter most in need of empirical measurement.</w:t>
       </w:r>
       <w:r>
@@ -1915,9 +1994,8 @@
     </w:p>
     <w:p>
       <w:r>
-        <w:lastRenderedPageBreak/>
         <w:pict w14:anchorId="509F91A7">
-          <v:rect id="_x0000_i1786" style="width:0;height:1.5pt" o:hralign="center" o:hrstd="t" o:hr="t"/>
+          <v:rect id="_x0000_i1026" style="width:0;height:1.5pt" o:hralign="center" o:hrstd="t" o:hr="t"/>
         </w:pict>
       </w:r>
     </w:p>
@@ -2199,7 +2277,7 @@
         <w:t>PJM dispatch window:</w:t>
       </w:r>
       <w:r>
-        <w:t xml:space="preserve"> 10–30 minutes advance notice (PJM Manual 13, Emergency Operations, Rev. 86, 2025).</w:t>
+        <w:t xml:space="preserve"> 10–30 minutes advance notice (PJM Manual 13, Emergency Operations, Rev. 97, 2025).</w:t>
       </w:r>
     </w:p>
     <w:p>
@@ -2226,6 +2304,7 @@
         <w:pStyle w:val="FirstParagraph"/>
       </w:pPr>
       <w:r>
+        <w:lastRenderedPageBreak/>
         <w:t>Even at 10× the observed P99 drain time (i.e., ~120 seconds), the operation completes well within the 10-minute minimum notice period.</w:t>
       </w:r>
     </w:p>
@@ -2434,7 +2513,13 @@
               <w:pStyle w:val="Compact"/>
             </w:pPr>
             <w:r>
-              <w:t>5.2M</w:t>
+              <w:t>5.2</w:t>
+            </w:r>
+            <w:r>
+              <w:t>9</w:t>
+            </w:r>
+            <w:r>
+              <w:t>M</w:t>
             </w:r>
           </w:p>
         </w:tc>
@@ -2487,7 +2572,6 @@
         <w:pStyle w:val="BodyText"/>
       </w:pPr>
       <w:r>
-        <w:lastRenderedPageBreak/>
         <w:t>Drain times are computed at an assumed generation rate of 60 tokens per second. Sensitivity to this assumption is reported in Extended Data Fig. 2 of the NE paper; the timescale argument is robust to significant variation.</w:t>
       </w:r>
     </w:p>
@@ -2617,6 +2701,7 @@
           <w:b/>
           <w:bCs/>
         </w:rPr>
+        <w:lastRenderedPageBreak/>
         <w:t>Configuration and orchestration errors.</w:t>
       </w:r>
       <w:r>
@@ -2634,7 +2719,7 @@
     <w:p>
       <w:r>
         <w:pict w14:anchorId="509F91A8">
-          <v:rect id="_x0000_i1787" style="width:0;height:1.5pt" o:hralign="center" o:hrstd="t" o:hr="t"/>
+          <v:rect id="_x0000_i1027" style="width:0;height:1.5pt" o:hralign="center" o:hrstd="t" o:hr="t"/>
         </w:pict>
       </w:r>
     </w:p>
@@ -2845,7 +2930,6 @@
       </w:pPr>
       <w:bookmarkStart w:id="24" w:name="what-d1-measures"/>
       <w:r>
-        <w:lastRenderedPageBreak/>
         <w:t>What D1 Measures</w:t>
       </w:r>
     </w:p>
@@ -2935,7 +3019,7 @@
         <w:pStyle w:val="FirstParagraph"/>
       </w:pPr>
       <w:r>
-        <w:t>Using 35,060 hours of day-ahead LMP data from January 2022 through December 2025 across 17 destination pricing zones mapped to verified data center locations (Baxtel commercial database; DOE/NREL Speed to Power county-level inventory):</w:t>
+        <w:t>Using 35,060 hours of day-ahead LMP data from January 2022 through December 2025 across 17 destination pricing zones mapped to verified data center locations (DOE/NREL Speed to Power county-level inventory):</w:t>
       </w:r>
     </w:p>
     <w:tbl>
@@ -3233,6 +3317,7 @@
               <w:pStyle w:val="Compact"/>
             </w:pPr>
             <w:r>
+              <w:lastRenderedPageBreak/>
               <w:t>CAISO NP15 (Silicon Valley)</w:t>
             </w:r>
           </w:p>
@@ -3332,15 +3417,18 @@
         <w:t>Cross-interconnection destinations (ERCOT, CAISO):</w:t>
       </w:r>
       <w:r>
-        <w:t xml:space="preserve"> ERCOT operates as an electrically isolated interconnection with no synchronous ties to the Eastern grid. CAISO has temporal offset and weather patterns largely independent from the Midwest. Capacity-weighted overlap ranges from 3.7% (ERCOT, summer) to 14.0% (CAISO, </w:t>
+        <w:t xml:space="preserve"> ERCOT operates as an electrically isolated interconnection with no synchronous ties to the Eastern grid. CAISO has temporal offset and weather patterns largely independent from the Midwest. </w:t>
+      </w:r>
+      <w:r>
+        <w:t xml:space="preserve">Capacity-weighted overlap ranges from 3.7% (ERCOT, summer) to 14.0% (CAISO, </w:t>
       </w:r>
       <w:proofErr w:type="gramStart"/>
       <w:r>
-        <w:t>annual</w:t>
+        <w:t>annual) —</w:t>
       </w:r>
       <w:proofErr w:type="gramEnd"/>
       <w:r>
-        <w:t xml:space="preserve">). CAISO exhibits zero summer </w:t>
+        <w:t xml:space="preserve"> that is, weighted by the data-center capacity mapped to each destination zone. (The companion stress decorrelation appendix reports the same relationships on an unweighted hour-count basis, where the annual ranges are 10–14% for both ERCOT and CAISO; the capacity-weighted numbers are lower because the largest-capacity destination zones are also the most decorrelated.) CAISO exhibits zero summer </w:t>
       </w:r>
       <w:proofErr w:type="gramStart"/>
       <w:r>
@@ -3374,7 +3462,6 @@
         <w:pStyle w:val="FirstParagraph"/>
       </w:pPr>
       <w:r>
-        <w:lastRenderedPageBreak/>
         <w:t>The interconnection boundary, not the balancing authority boundary, creates the strongest decorrelation.</w:t>
       </w:r>
     </w:p>
@@ -3498,13 +3585,14 @@
         <w:pStyle w:val="FirstParagraph"/>
       </w:pPr>
       <w:r>
+        <w:lastRenderedPageBreak/>
         <w:t>D1 contributes less than 1% of cascade variance because its empirical range is narrow and its central value is near 1.0.</w:t>
       </w:r>
     </w:p>
     <w:p>
       <w:r>
         <w:pict w14:anchorId="509F91A9">
-          <v:rect id="_x0000_i1788" style="width:0;height:1.5pt" o:hralign="center" o:hrstd="t" o:hr="t"/>
+          <v:rect id="_x0000_i1028" style="width:0;height:1.5pt" o:hralign="center" o:hrstd="t" o:hr="t"/>
         </w:pict>
       </w:r>
     </w:p>
@@ -3736,7 +3824,6 @@
       <w:bookmarkStart w:id="32" w:name="derivation-from-utilization-estimates"/>
       <w:bookmarkEnd w:id="31"/>
       <w:r>
-        <w:lastRenderedPageBreak/>
         <w:t>Derivation from Utilization Estimates</w:t>
       </w:r>
     </w:p>
@@ -3755,11 +3842,11 @@
         <w:tblLook w:val="0020" w:firstRow="1" w:lastRow="0" w:firstColumn="0" w:lastColumn="0" w:noHBand="0" w:noVBand="0"/>
       </w:tblPr>
       <w:tblGrid>
-        <w:gridCol w:w="2219"/>
-        <w:gridCol w:w="1953"/>
-        <w:gridCol w:w="2082"/>
-        <w:gridCol w:w="1595"/>
-        <w:gridCol w:w="1727"/>
+        <w:gridCol w:w="2136"/>
+        <w:gridCol w:w="2071"/>
+        <w:gridCol w:w="2017"/>
+        <w:gridCol w:w="1530"/>
+        <w:gridCol w:w="1822"/>
       </w:tblGrid>
       <w:tr>
         <w:trPr>
@@ -3842,7 +3929,7 @@
               <w:pStyle w:val="Compact"/>
             </w:pPr>
             <w:r>
-              <w:t>LBNL 2024 DC Energy Report</w:t>
+              <w:t>Industry Utilization Synthesis</w:t>
             </w:r>
           </w:p>
         </w:tc>
@@ -3894,7 +3981,7 @@
               <w:pStyle w:val="Compact"/>
             </w:pPr>
             <w:r>
-              <w:t>Shehabi et al. (2024)</w:t>
+              <w:t>Norris (2025); industry reports</w:t>
             </w:r>
           </w:p>
         </w:tc>
@@ -3922,33 +4009,36 @@
               <w:pStyle w:val="Compact"/>
             </w:pPr>
             <w:r>
-              <w:t>Server-level CPU utilization</w:t>
-            </w:r>
-          </w:p>
-        </w:tc>
-        <w:tc>
-          <w:tcPr>
-            <w:tcW w:w="0" w:type="auto"/>
-          </w:tcPr>
-          <w:p>
-            <w:pPr>
-              <w:pStyle w:val="Compact"/>
-            </w:pPr>
-            <w:r>
-              <w:t>12–18%</w:t>
-            </w:r>
-          </w:p>
-        </w:tc>
-        <w:tc>
-          <w:tcPr>
-            <w:tcW w:w="0" w:type="auto"/>
-          </w:tcPr>
-          <w:p>
-            <w:pPr>
-              <w:pStyle w:val="Compact"/>
-            </w:pPr>
-            <w:r>
-              <w:t>0.82–0.88</w:t>
+              <w:t>Distribution of VM CPU utilization</w:t>
+            </w:r>
+          </w:p>
+        </w:tc>
+        <w:tc>
+          <w:tcPr>
+            <w:tcW w:w="0" w:type="auto"/>
+          </w:tcPr>
+          <w:p>
+            <w:pPr>
+              <w:pStyle w:val="Compact"/>
+            </w:pPr>
+            <w:r>
+              <w:t>60% of VMs below 20% average</w:t>
+            </w:r>
+          </w:p>
+        </w:tc>
+        <w:tc>
+          <w:tcPr>
+            <w:tcW w:w="0" w:type="auto"/>
+          </w:tcPr>
+          <w:p>
+            <w:pPr>
+              <w:pStyle w:val="Compact"/>
+            </w:pPr>
+            <w:r>
+              <w:t>0.</w:t>
+            </w:r>
+            <w:r>
+              <w:t>80+ on bulk of fleet</w:t>
             </w:r>
           </w:p>
         </w:tc>
@@ -4042,8 +4132,13 @@
             <w:pPr>
               <w:pStyle w:val="Compact"/>
             </w:pPr>
-            <w:r>
-              <w:t>DynamoLLM inference clusters</w:t>
+            <w:proofErr w:type="spellStart"/>
+            <w:r>
+              <w:t>DynamoLLM</w:t>
+            </w:r>
+            <w:proofErr w:type="spellEnd"/>
+            <w:r>
+              <w:t xml:space="preserve"> inference clusters</w:t>
             </w:r>
           </w:p>
         </w:tc>
@@ -4110,7 +4205,13 @@
               <w:pStyle w:val="Compact"/>
             </w:pPr>
             <w:r>
-              <w:t>Norris (Duke, Aug 2025)</w:t>
+              <w:t>Norris (Aug</w:t>
+            </w:r>
+            <w:r>
+              <w:t xml:space="preserve"> 8,</w:t>
+            </w:r>
+            <w:r>
+              <w:t xml:space="preserve"> 2025)</w:t>
             </w:r>
           </w:p>
         </w:tc>
@@ -4136,7 +4237,7 @@
               <w:pStyle w:val="Compact"/>
             </w:pPr>
             <w:r>
-              <w:t>40–70% actual vs 90%+ perceived</w:t>
+              <w:t>~50% actual vs. 90-100% perceived</w:t>
             </w:r>
           </w:p>
         </w:tc>
@@ -4173,7 +4274,11 @@
         <w:pStyle w:val="BodyText"/>
       </w:pPr>
       <w:r>
-        <w:t xml:space="preserve">The central value of 0.33 implies 67% average GPU utilization at destination inference facilities — plausible given that facilities maintain spare capacity for redundancy, burst handling, and business continuity. The lower bound of 0.20 extends below the </w:t>
+        <w:t xml:space="preserve">The central value of 0.33 implies 67% average GPU utilization at destination inference facilities — plausible given that facilities maintain spare capacity for redundancy, burst </w:t>
+      </w:r>
+      <w:r>
+        <w:lastRenderedPageBreak/>
+        <w:t xml:space="preserve">handling, and business continuity. The lower bound of 0.20 extends below the </w:t>
       </w:r>
       <w:proofErr w:type="gramStart"/>
       <w:r>
@@ -4241,7 +4346,6 @@
         </w:numPr>
       </w:pPr>
       <w:r>
-        <w:lastRenderedPageBreak/>
         <w:t>No published study directly measures GPU-level utilization distributions at production inference facilities</w:t>
       </w:r>
     </w:p>
@@ -4275,7 +4379,7 @@
     <w:p>
       <w:r>
         <w:pict w14:anchorId="509F91AA">
-          <v:rect id="_x0000_i1789" style="width:0;height:1.5pt" o:hralign="center" o:hrstd="t" o:hr="t"/>
+          <v:rect id="_x0000_i1029" style="width:0;height:1.5pt" o:hralign="center" o:hrstd="t" o:hr="t"/>
         </w:pict>
       </w:r>
     </w:p>
@@ -4456,6 +4560,7 @@
       </w:pPr>
       <w:bookmarkStart w:id="36" w:name="what-d3-measures"/>
       <w:r>
+        <w:lastRenderedPageBreak/>
         <w:t>What D3 Measures</w:t>
       </w:r>
     </w:p>
@@ -4564,11 +4669,7 @@
         <w:pStyle w:val="FirstParagraph"/>
       </w:pPr>
       <w:r>
-        <w:t xml:space="preserve">TensorRT-LLM compiles models to GPU-architecture-specific engines identified by CUDA compute capability (e.g., 80 for A100, 90 for Hopper). An A100 engine cannot execute on an H100 without recompilation, which adds 5–30 minutes per model depending on model </w:t>
-      </w:r>
-      <w:r>
-        <w:lastRenderedPageBreak/>
-        <w:t>size. A multi-site operator using TensorRT-LLM would need to pre-stage compiled engines for all destination GPU architectures, or use framework-agnostic serving (vLLM, TGI).</w:t>
+        <w:t>TensorRT-LLM compiles models to GPU-architecture-specific engines identified by CUDA compute capability (e.g., 80 for A100, 90 for Hopper). An A100 engine cannot execute on an H100 without recompilation, which adds 5–30 minutes per model depending on model size. A multi-site operator using TensorRT-LLM would need to pre-stage compiled engines for all destination GPU architectures, or use framework-agnostic serving (vLLM, TGI).</w:t>
       </w:r>
     </w:p>
     <w:p>
@@ -4630,6 +4731,7 @@
         <w:pStyle w:val="BodyText"/>
       </w:pPr>
       <w:r>
+        <w:lastRenderedPageBreak/>
         <w:t xml:space="preserve">D3 is held fixed in the conditional Monte Carlo because it is fundamentally a </w:t>
       </w:r>
       <w:r>
@@ -4654,7 +4756,7 @@
     <w:p>
       <w:r>
         <w:pict w14:anchorId="509F91AB">
-          <v:rect id="_x0000_i1790" style="width:0;height:1.5pt" o:hralign="center" o:hrstd="t" o:hr="t"/>
+          <v:rect id="_x0000_i1030" style="width:0;height:1.5pt" o:hralign="center" o:hrstd="t" o:hr="t"/>
         </w:pict>
       </w:r>
     </w:p>
@@ -4886,7 +4988,6 @@
       <w:bookmarkStart w:id="43" w:name="range-justification-2"/>
       <w:bookmarkEnd w:id="42"/>
       <w:r>
-        <w:lastRenderedPageBreak/>
         <w:t>Range Justification</w:t>
       </w:r>
     </w:p>
@@ -4994,13 +5095,14 @@
         <w:pStyle w:val="BodyText"/>
       </w:pPr>
       <w:r>
+        <w:lastRenderedPageBreak/>
         <w:t>D4 is not directly observable in public data. The inference-to-training ratio at specific destination facilities is an operational detail that operators do not disclose.</w:t>
       </w:r>
     </w:p>
     <w:p>
       <w:r>
         <w:pict w14:anchorId="509F91AC">
-          <v:rect id="_x0000_i1791" style="width:0;height:1.5pt" o:hralign="center" o:hrstd="t" o:hr="t"/>
+          <v:rect id="_x0000_i1031" style="width:0;height:1.5pt" o:hralign="center" o:hrstd="t" o:hr="t"/>
         </w:pict>
       </w:r>
     </w:p>
@@ -5258,7 +5360,6 @@
         </w:numPr>
       </w:pPr>
       <w:r>
-        <w:lastRenderedPageBreak/>
         <w:t>Cold-start latency (loading weights from storage into GPU memory) adds additional minutes</w:t>
       </w:r>
     </w:p>
@@ -5348,6 +5449,7 @@
           <w:b/>
           <w:bCs/>
         </w:rPr>
+        <w:lastRenderedPageBreak/>
         <w:t>Ceiling (0.80):</w:t>
       </w:r>
       <w:r>
@@ -5440,7 +5542,7 @@
     <w:p>
       <w:r>
         <w:pict w14:anchorId="509F91AD">
-          <v:rect id="_x0000_i1792" style="width:0;height:1.5pt" o:hralign="center" o:hrstd="t" o:hr="t"/>
+          <v:rect id="_x0000_i1032" style="width:0;height:1.5pt" o:hralign="center" o:hrstd="t" o:hr="t"/>
         </w:pict>
       </w:r>
     </w:p>
@@ -5453,7 +5555,6 @@
       <w:bookmarkEnd w:id="45"/>
       <w:bookmarkEnd w:id="49"/>
       <w:r>
-        <w:lastRenderedPageBreak/>
         <w:t>4. Execution Parameters</w:t>
       </w:r>
     </w:p>
@@ -5682,9 +5783,9 @@
         <w:tblLook w:val="0020" w:firstRow="1" w:lastRow="0" w:firstColumn="0" w:lastColumn="0" w:noHBand="0" w:noVBand="0"/>
       </w:tblPr>
       <w:tblGrid>
-        <w:gridCol w:w="1601"/>
-        <w:gridCol w:w="1689"/>
-        <w:gridCol w:w="6286"/>
+        <w:gridCol w:w="1533"/>
+        <w:gridCol w:w="1863"/>
+        <w:gridCol w:w="6180"/>
       </w:tblGrid>
       <w:tr>
         <w:trPr>
@@ -5741,19 +5842,24 @@
               <w:pStyle w:val="Compact"/>
             </w:pPr>
             <w:r>
-              <w:t>AWS Elastic Load Balancing (multi-AZ)</w:t>
-            </w:r>
-          </w:p>
-        </w:tc>
-        <w:tc>
-          <w:tcPr>
-            <w:tcW w:w="0" w:type="auto"/>
-          </w:tcPr>
-          <w:p>
-            <w:pPr>
-              <w:pStyle w:val="Compact"/>
-            </w:pPr>
-            <w:r>
+              <w:t xml:space="preserve">AWS Elastic Load Balancing </w:t>
+            </w:r>
+            <w:r>
+              <w:lastRenderedPageBreak/>
+              <w:t>(multi-AZ)</w:t>
+            </w:r>
+          </w:p>
+        </w:tc>
+        <w:tc>
+          <w:tcPr>
+            <w:tcW w:w="0" w:type="auto"/>
+          </w:tcPr>
+          <w:p>
+            <w:pPr>
+              <w:pStyle w:val="Compact"/>
+            </w:pPr>
+            <w:r>
+              <w:lastRenderedPageBreak/>
               <w:t>≥99.99% monthly</w:t>
             </w:r>
           </w:p>
@@ -5877,7 +5983,7 @@
               <w:pStyle w:val="Compact"/>
             </w:pPr>
             <w:r>
-              <w:t>~50 high-impact events/year</w:t>
+              <w:t>&gt;100 high-impact events across multi-year study period</w:t>
             </w:r>
           </w:p>
         </w:tc>
@@ -5951,7 +6057,6 @@
           <w:b/>
           <w:bCs/>
         </w:rPr>
-        <w:lastRenderedPageBreak/>
         <w:t>F4: Checkpoint corruption / partial transfer.</w:t>
       </w:r>
       <w:r>
@@ -6041,7 +6146,7 @@
     <w:p>
       <w:r>
         <w:pict w14:anchorId="509F91AE">
-          <v:rect id="_x0000_i1793" style="width:0;height:1.5pt" o:hralign="center" o:hrstd="t" o:hr="t"/>
+          <v:rect id="_x0000_i1033" style="width:0;height:1.5pt" o:hralign="center" o:hrstd="t" o:hr="t"/>
         </w:pict>
       </w:r>
     </w:p>
@@ -6053,6 +6158,7 @@
       <w:bookmarkEnd w:id="51"/>
       <w:bookmarkEnd w:id="54"/>
       <w:r>
+        <w:lastRenderedPageBreak/>
         <w:t>E2: Bandwidth Adequacy</w:t>
       </w:r>
     </w:p>
@@ -6342,9 +6448,13 @@
           <w:numId w:val="22"/>
         </w:numPr>
       </w:pPr>
-      <w:r>
-        <w:lastRenderedPageBreak/>
-        <w:t>Total hyperscaler bandwidth purchases reached 42.4 terabits in 2024 (Data Center Knowledge, November 2025)</w:t>
+      <w:proofErr w:type="spellStart"/>
+      <w:r>
+        <w:t>Hyperscaler</w:t>
+      </w:r>
+      <w:proofErr w:type="spellEnd"/>
+      <w:r>
+        <w:t xml:space="preserve"> bandwidth purchases on Zayo’s network reached 42.4 Tb cumulatively from 2020–2024, a 133% increase over the period (Zayo Bandwidth Report 2025, via Data Center Knowledge, November 2025), reflecting the network-side buildout supporting interconnect between AI training clusters</w:t>
       </w:r>
     </w:p>
     <w:p>
@@ -6420,13 +6530,17 @@
         <w:pStyle w:val="FirstParagraph"/>
       </w:pPr>
       <w:r>
-        <w:t>The reduction from 1.0 accounts for: - Transient WAN congestion during extreme events (when multiple operators may simultaneously attempt migration) - Smaller facilities with less redundant WAN connectivity than hyperscale campuses - The possibility of correlated network stress during grid emergencies (ice storms that damage both power lines and fiber)</w:t>
+        <w:t xml:space="preserve">The reduction from 1.0 accounts for: - Transient WAN congestion during extreme events (when multiple operators may simultaneously attempt migration) - Smaller facilities with less redundant WAN connectivity than hyperscale campuses - The possibility of correlated </w:t>
+      </w:r>
+      <w:r>
+        <w:lastRenderedPageBreak/>
+        <w:t>network stress during grid emergencies (ice storms that damage both power lines and fiber)</w:t>
       </w:r>
     </w:p>
     <w:p>
       <w:r>
         <w:pict w14:anchorId="509F91AF">
-          <v:rect id="_x0000_i1794" style="width:0;height:1.5pt" o:hralign="center" o:hrstd="t" o:hr="t"/>
+          <v:rect id="_x0000_i1034" style="width:0;height:1.5pt" o:hralign="center" o:hrstd="t" o:hr="t"/>
         </w:pict>
       </w:r>
     </w:p>
@@ -7190,24 +7304,19 @@
               <w:pStyle w:val="Compact"/>
             </w:pPr>
             <w:r>
-              <w:t xml:space="preserve">Inference </w:t>
-            </w:r>
-            <w:r>
-              <w:lastRenderedPageBreak/>
-              <w:t>workload share</w:t>
-            </w:r>
-          </w:p>
-        </w:tc>
-        <w:tc>
-          <w:tcPr>
-            <w:tcW w:w="0" w:type="auto"/>
-          </w:tcPr>
-          <w:p>
-            <w:pPr>
-              <w:pStyle w:val="Compact"/>
-            </w:pPr>
-            <w:r>
-              <w:lastRenderedPageBreak/>
+              <w:t>Inference workload share</w:t>
+            </w:r>
+          </w:p>
+        </w:tc>
+        <w:tc>
+          <w:tcPr>
+            <w:tcW w:w="0" w:type="auto"/>
+          </w:tcPr>
+          <w:p>
+            <w:pPr>
+              <w:pStyle w:val="Compact"/>
+            </w:pPr>
+            <w:r>
               <w:t>0.33</w:t>
             </w:r>
           </w:p>
@@ -7247,11 +7356,7 @@
               <w:pStyle w:val="Compact"/>
             </w:pPr>
             <w:r>
-              <w:t>ESTIMATED-</w:t>
-            </w:r>
-            <w:r>
-              <w:lastRenderedPageBreak/>
-              <w:t>MODERATE</w:t>
+              <w:t>ESTIMATED-MODERATE</w:t>
             </w:r>
           </w:p>
         </w:tc>
@@ -7266,7 +7371,6 @@
               <w:pStyle w:val="Compact"/>
             </w:pPr>
             <w:r>
-              <w:lastRenderedPageBreak/>
               <w:t>D5</w:t>
             </w:r>
           </w:p>
@@ -7859,6 +7963,7 @@
               <w:pStyle w:val="Compact"/>
             </w:pPr>
             <w:r>
+              <w:lastRenderedPageBreak/>
               <w:t>Optimistic</w:t>
             </w:r>
           </w:p>
@@ -8187,7 +8292,7 @@
     <w:p>
       <w:r>
         <w:pict w14:anchorId="509F91B0">
-          <v:rect id="_x0000_i1795" style="width:0;height:1.5pt" o:hralign="center" o:hrstd="t" o:hr="t"/>
+          <v:rect id="_x0000_i1035" style="width:0;height:1.5pt" o:hralign="center" o:hrstd="t" o:hr="t"/>
         </w:pict>
       </w:r>
     </w:p>
@@ -8199,7 +8304,6 @@
       <w:bookmarkEnd w:id="60"/>
       <w:bookmarkEnd w:id="63"/>
       <w:r>
-        <w:lastRenderedPageBreak/>
         <w:t>6. Variance Decomposition</w:t>
       </w:r>
     </w:p>
@@ -8829,6 +8933,7 @@
         <w:pStyle w:val="BodyText"/>
       </w:pPr>
       <w:r>
+        <w:lastRenderedPageBreak/>
         <w:t>The Σ η² ≈ 1.0 confirms negligible parameter interactions, validating the multiplicative independence assumption.</w:t>
       </w:r>
     </w:p>
@@ -8977,7 +9082,6 @@
               <w:pStyle w:val="Compact"/>
             </w:pPr>
             <w:r>
-              <w:lastRenderedPageBreak/>
               <w:t>Parameter</w:t>
             </w:r>
           </w:p>
@@ -9296,7 +9400,7 @@
     <w:p>
       <w:r>
         <w:pict w14:anchorId="509F91B1">
-          <v:rect id="_x0000_i1796" style="width:0;height:1.5pt" o:hralign="center" o:hrstd="t" o:hr="t"/>
+          <v:rect id="_x0000_i1036" style="width:0;height:1.5pt" o:hralign="center" o:hrstd="t" o:hr="t"/>
         </w:pict>
       </w:r>
     </w:p>
@@ -9334,6 +9438,7 @@
         <w:pStyle w:val="BodyText"/>
       </w:pPr>
       <w:r>
+        <w:lastRenderedPageBreak/>
         <w:t>This means the DVFS + Spatial portfolio faces no duration-based Non-Performance Charge exposure. A BTM battery portfolio fails during extended events — Winter Storm Elliott lasted 4+ days, with 17+ hours of continuous emergency dispatch. The spatial portfolio continues operating through hour 17 at the same effective depth, provided any destination remains unstressed. Per the Cross-BA analysis, at least one destination was available in 99.0% of observed stress hours.</w:t>
       </w:r>
     </w:p>
@@ -9348,7 +9453,7 @@
     <w:p>
       <w:r>
         <w:pict w14:anchorId="509F91B2">
-          <v:rect id="_x0000_i1797" style="width:0;height:1.5pt" o:hralign="center" o:hrstd="t" o:hr="t"/>
+          <v:rect id="_x0000_i1037" style="width:0;height:1.5pt" o:hralign="center" o:hrstd="t" o:hr="t"/>
         </w:pict>
       </w:r>
     </w:p>
@@ -9418,7 +9523,6 @@
           <w:b/>
           <w:bCs/>
         </w:rPr>
-        <w:lastRenderedPageBreak/>
         <w:t>D2 (utilization headroom) is a placeholder.</w:t>
       </w:r>
       <w:r>
@@ -9499,6 +9603,7 @@
           <w:b/>
           <w:bCs/>
         </w:rPr>
+        <w:lastRenderedPageBreak/>
         <w:t>Multiplicative independence.</w:t>
       </w:r>
       <w:r>
@@ -9508,7 +9613,7 @@
     <w:p>
       <w:r>
         <w:pict w14:anchorId="509F91B3">
-          <v:rect id="_x0000_i1798" style="width:0;height:1.5pt" o:hralign="center" o:hrstd="t" o:hr="t"/>
+          <v:rect id="_x0000_i1038" style="width:0;height:1.5pt" o:hralign="center" o:hrstd="t" o:hr="t"/>
         </w:pict>
       </w:r>
     </w:p>
@@ -9769,7 +9874,6 @@
               <w:pStyle w:val="Compact"/>
             </w:pPr>
             <w:r>
-              <w:lastRenderedPageBreak/>
               <w:t>E2 value</w:t>
             </w:r>
           </w:p>
@@ -10009,13 +10113,17 @@
         <w:t>2. Destination decomposition.</w:t>
       </w:r>
       <w:r>
-        <w:t xml:space="preserve"> The old D2 (0.85) conflated utilization headroom, inference compatibility, and pre-staging readiness into a single estimate. Decomposing into D2 × D4 × D5 = 0.33 × 0.50 × 0.65 = 0.107 reveals that destination absorption capacity is much lower than previously assumed, and that the uncertainty concentrates in three operationally distinct choices that different policy levers can target independently.</w:t>
+        <w:t xml:space="preserve"> The old D2 (0.85) conflated utilization headroom, inference compatibility, and pre-staging readiness into a single estimate. Decomposing into D2 × D4 × D5 = 0.33 × 0.50 × 0.65 = 0.107 reveals that destination absorption capacity is </w:t>
+      </w:r>
+      <w:r>
+        <w:lastRenderedPageBreak/>
+        <w:t>much lower than previously assumed, and that the uncertainty concentrates in three operationally distinct choices that different policy levers can target independently.</w:t>
       </w:r>
     </w:p>
     <w:p>
       <w:r>
         <w:pict w14:anchorId="509F91B4">
-          <v:rect id="_x0000_i1799" style="width:0;height:1.5pt" o:hralign="center" o:hrstd="t" o:hr="t"/>
+          <v:rect id="_x0000_i1039" style="width:0;height:1.5pt" o:hralign="center" o:hrstd="t" o:hr="t"/>
         </w:pict>
       </w:r>
     </w:p>
@@ -10050,8 +10158,58 @@
         <w:pStyle w:val="BodyText"/>
       </w:pPr>
       <w:r>
-        <w:t>Colangelo, P., et al. AI data centres as grid-interactive assets. Nature Energy 11, 254–261 (2026). https://doi.org/10.1038/s41560-025-01927-1</w:t>
-      </w:r>
+        <w:t xml:space="preserve">Colangelo, P., Coskun, A. K., </w:t>
+      </w:r>
+      <w:proofErr w:type="spellStart"/>
+      <w:r>
+        <w:t>Megrue</w:t>
+      </w:r>
+      <w:proofErr w:type="spellEnd"/>
+      <w:r>
+        <w:t xml:space="preserve">, J., Roberts, C., Sengupta, S., Sivaram, V., Tiao, E., </w:t>
+      </w:r>
+      <w:proofErr w:type="spellStart"/>
+      <w:r>
+        <w:t>Vijaykar</w:t>
+      </w:r>
+      <w:proofErr w:type="spellEnd"/>
+      <w:r>
+        <w:t xml:space="preserve">, A., Williams, C., Wilson, D. C., Records, B., MacFarland, Z., Dreiling, D., Morey, N., Ratnayake, A., &amp; </w:t>
+      </w:r>
+      <w:proofErr w:type="spellStart"/>
+      <w:r>
+        <w:t>Vairamohan</w:t>
+      </w:r>
+      <w:proofErr w:type="spellEnd"/>
+      <w:r>
+        <w:t xml:space="preserve">, B. AI data </w:t>
+      </w:r>
+      <w:proofErr w:type="spellStart"/>
+      <w:r>
+        <w:t>centres</w:t>
+      </w:r>
+      <w:proofErr w:type="spellEnd"/>
+      <w:r>
+        <w:t xml:space="preserve"> as grid-interactive assets. </w:t>
+      </w:r>
+      <w:r>
+        <w:rPr>
+          <w:i/>
+          <w:iCs/>
+        </w:rPr>
+        <w:t>Nature Energy</w:t>
+      </w:r>
+      <w:r>
+        <w:t xml:space="preserve"> 11, 254–261 (2026). </w:t>
+      </w:r>
+      <w:hyperlink r:id="rId8" w:history="1">
+        <w:r>
+          <w:rPr>
+            <w:rStyle w:val="Hyperlink"/>
+          </w:rPr>
+          <w:t>https://doi.org/10.1038/s41560-025-01927-1</w:t>
+        </w:r>
+      </w:hyperlink>
     </w:p>
     <w:p>
       <w:pPr>
@@ -10098,8 +10256,97 @@
         <w:pStyle w:val="BodyText"/>
       </w:pPr>
       <w:r>
+        <w:t>Govindan, R., et al. Evolve or die: High-availability design principles drawn from Google’s network infrastructure. ACM SIGCOMM (2016).</w:t>
+      </w:r>
+    </w:p>
+    <w:p>
+      <w:pPr>
+        <w:pStyle w:val="BodyText"/>
+      </w:pPr>
+      <w:r>
+        <w:t xml:space="preserve">Jain, S., et al. B4: Experience with a </w:t>
+      </w:r>
+      <w:proofErr w:type="gramStart"/>
+      <w:r>
+        <w:t>globally-deployed</w:t>
+      </w:r>
+      <w:proofErr w:type="gramEnd"/>
+      <w:r>
+        <w:t xml:space="preserve"> software defined WAN. ACM SIGCOMM (2013).</w:t>
+      </w:r>
+    </w:p>
+    <w:p>
+      <w:pPr>
+        <w:pStyle w:val="BodyText"/>
+      </w:pPr>
+      <w:r>
+        <w:t>Kakolyris, A., et al. SLO-aware GPU DVFS for energy-efficient LLM inference serving. IEEE Computer Architecture Letters (2024).</w:t>
+      </w:r>
+    </w:p>
+    <w:p>
+      <w:pPr>
+        <w:pStyle w:val="BodyText"/>
+      </w:pPr>
+      <w:r>
+        <w:t>LBNL. 2024 United States Data Center Energy Usage Report. Lawrence Berkeley National Laboratory (2024).</w:t>
+      </w:r>
+    </w:p>
+    <w:p>
+      <w:pPr>
+        <w:pStyle w:val="BodyText"/>
+      </w:pPr>
+      <w:r>
+        <w:t>McKinsey &amp; Company. Data Center Demand Model (December 2025).</w:t>
+      </w:r>
+    </w:p>
+    <w:p>
+      <w:pPr>
+        <w:pStyle w:val="BodyText"/>
+      </w:pPr>
+      <w:r>
+        <w:t>Microsoft Azure. SLA for Load Balancer. https://azure.microsoft.com/en-us/support/legal/sla/load-balancer/</w:t>
+      </w:r>
+    </w:p>
+    <w:p>
+      <w:pPr>
+        <w:pStyle w:val="BodyText"/>
+      </w:pPr>
+      <w:r>
+        <w:t xml:space="preserve">Norris, T. H. The puzzle of low data center utilization rates. </w:t>
+      </w:r>
+      <w:r>
+        <w:rPr>
+          <w:i/>
+          <w:iCs/>
+        </w:rPr>
+        <w:t>Power &amp; Policy</w:t>
+      </w:r>
+      <w:r>
+        <w:t xml:space="preserve"> Substack, August 8, 2025.</w:t>
+      </w:r>
+    </w:p>
+    <w:p>
+      <w:pPr>
+        <w:pStyle w:val="BodyText"/>
+      </w:pPr>
+    </w:p>
+    <w:p>
+      <w:pPr>
+        <w:pStyle w:val="BodyText"/>
+      </w:pPr>
+      <w:r>
         <w:lastRenderedPageBreak/>
-        <w:t>Govindan, R., et al. Evolve or die: High-availability design principles drawn from Google’s network infrastructure. ACM SIGCOMM (2016).</w:t>
+        <w:t xml:space="preserve">Norris, T. H., Profeta, T., Patino-Echeverri, D., &amp; Cowie-Haskell, A. </w:t>
+      </w:r>
+      <w:r>
+        <w:rPr>
+          <w:i/>
+          <w:iCs/>
+        </w:rPr>
+        <w:t>Rethinking Load Growth: Assessing the Potential for Integration of Large Flexible Loads in US Power Systems.</w:t>
+      </w:r>
+      <w:r>
+        <w:t xml:space="preserve"> NI R 25-01. Nicholas Institute for Energy, Environment &amp; Sustainability, Duke University (March 2025).</w:t>
       </w:r>
     </w:p>
     <w:p>
@@ -10107,15 +10354,7 @@
         <w:pStyle w:val="BodyText"/>
       </w:pPr>
       <w:r>
-        <w:t xml:space="preserve">Jain, S., et al. B4: Experience with a </w:t>
-      </w:r>
-      <w:proofErr w:type="gramStart"/>
-      <w:r>
-        <w:t>globally-deployed</w:t>
-      </w:r>
-      <w:proofErr w:type="gramEnd"/>
-      <w:r>
-        <w:t xml:space="preserve"> software defined WAN. ACM SIGCOMM (2013).</w:t>
+        <w:t>NVIDIA. CUDA Compatibility Documentation. https://docs.nvidia.com/deploy/cuda-compatibility/</w:t>
       </w:r>
     </w:p>
     <w:p>
@@ -10123,7 +10362,7 @@
         <w:pStyle w:val="BodyText"/>
       </w:pPr>
       <w:r>
-        <w:t>Kakolyris, A., et al. SLO-aware GPU DVFS for energy-efficient LLM inference serving. IEEE Computer Architecture Letters (2024).</w:t>
+        <w:t>NVIDIA. CUDA Forward Compatibility Documentation. https://docs.nvidia.com/deploy/cuda-compatibility/forward-compatibility.html</w:t>
       </w:r>
     </w:p>
     <w:p>
@@ -10131,7 +10370,7 @@
         <w:pStyle w:val="BodyText"/>
       </w:pPr>
       <w:r>
-        <w:t>LBNL. 2024 United States Data Center Energy Usage Report. Lawrence Berkeley National Laboratory (2024).</w:t>
+        <w:t>NVIDIA. Run:ai Model Streamer: Reducing cold start latency for LLM inference (2025).</w:t>
       </w:r>
     </w:p>
     <w:p>
@@ -10139,7 +10378,7 @@
         <w:pStyle w:val="BodyText"/>
       </w:pPr>
       <w:r>
-        <w:t>McKinsey &amp; Company. Data Center Demand Model (December 2025).</w:t>
+        <w:t>NVIDIA. TensorRT-LLM Support Matrix. https://nvidia.github.io/TensorRT-LLM/reference/support-matrix.html</w:t>
       </w:r>
     </w:p>
     <w:p>
@@ -10147,7 +10386,7 @@
         <w:pStyle w:val="BodyText"/>
       </w:pPr>
       <w:r>
-        <w:t>Microsoft Azure. SLA for Load Balancer. https://azure.microsoft.com/en-us/support/legal/sla/load-balancer/</w:t>
+        <w:t>Patel, P., et al. Splitwise: Efficient generative LLM inference using phase splitting. ISCA (2024).</w:t>
       </w:r>
     </w:p>
     <w:p>
@@ -10155,7 +10394,7 @@
         <w:pStyle w:val="BodyText"/>
       </w:pPr>
       <w:r>
-        <w:t>Norris, T. H. The puzzle of low data center utilization rates. Power &amp; Policy (August 2025).</w:t>
+        <w:t>Patel, T., et al. Characterizing power management opportunities for LLMs in the cloud. ASPLOS (2024).</w:t>
       </w:r>
     </w:p>
     <w:p>
@@ -10163,7 +10402,7 @@
         <w:pStyle w:val="BodyText"/>
       </w:pPr>
       <w:r>
-        <w:t>NVIDIA. CUDA Compatibility Documentation. https://docs.nvidia.com/deploy/cuda-compatibility/</w:t>
+        <w:t>PJM Interconnection. Manual 13: Emergency Operations. Rev. 97, effective November 20, 2025.</w:t>
       </w:r>
     </w:p>
     <w:p>
@@ -10171,7 +10410,33 @@
         <w:pStyle w:val="BodyText"/>
       </w:pPr>
       <w:r>
-        <w:t>NVIDIA. CUDA Forward Compatibility Documentation. https://docs.nvidia.com/deploy/cuda-compatibility/forward-compatibility.html</w:t>
+        <w:t xml:space="preserve">Radovanović, A., </w:t>
+      </w:r>
+      <w:proofErr w:type="spellStart"/>
+      <w:r>
+        <w:t>Koningstein</w:t>
+      </w:r>
+      <w:proofErr w:type="spellEnd"/>
+      <w:r>
+        <w:t xml:space="preserve">, R., Schneider, I., Chen, B., Duarte, A., Roy, B., Xiao, D., </w:t>
+      </w:r>
+      <w:proofErr w:type="spellStart"/>
+      <w:r>
+        <w:t>Haridasan</w:t>
+      </w:r>
+      <w:proofErr w:type="spellEnd"/>
+      <w:r>
+        <w:t xml:space="preserve">, M., Hung, P., Care, N., Talukdar, S., Mullen, E., Smith, K., Cottman, M., &amp; Cirne, W. Carbon-aware computing for datacenters. </w:t>
+      </w:r>
+      <w:r>
+        <w:rPr>
+          <w:i/>
+          <w:iCs/>
+        </w:rPr>
+        <w:t>IEEE Transactions on Power Systems</w:t>
+      </w:r>
+      <w:r>
+        <w:t xml:space="preserve"> 38(2), 1270–1280 (2023). https://doi.org/10.1109/TPWRS.2022.3173250</w:t>
       </w:r>
     </w:p>
     <w:p>
@@ -10179,7 +10444,31 @@
         <w:pStyle w:val="BodyText"/>
       </w:pPr>
       <w:r>
-        <w:t>NVIDIA. Run:ai Model Streamer: Reducing cold start latency for LLM inference (2025).</w:t>
+        <w:t xml:space="preserve">Jaiswal, S., Jain, K., </w:t>
+      </w:r>
+      <w:proofErr w:type="spellStart"/>
+      <w:r>
+        <w:t>Simmhan</w:t>
+      </w:r>
+      <w:proofErr w:type="spellEnd"/>
+      <w:r>
+        <w:t xml:space="preserve">, Y., </w:t>
+      </w:r>
+      <w:proofErr w:type="spellStart"/>
+      <w:r>
+        <w:t>Parayil</w:t>
+      </w:r>
+      <w:proofErr w:type="spellEnd"/>
+      <w:r>
+        <w:t>, A., Mallick, A., St. Amant, R., et al. </w:t>
+      </w:r>
+      <w:proofErr w:type="spellStart"/>
+      <w:r>
+        <w:t>SageServe</w:t>
+      </w:r>
+      <w:proofErr w:type="spellEnd"/>
+      <w:r>
+        <w:t>: Optimizing LLM Serving on Cloud Data Centers with Forecast Aware Auto-Scaling. arXiv:2502.14617 (2025).</w:t>
       </w:r>
     </w:p>
     <w:p>
@@ -10187,7 +10476,7 @@
         <w:pStyle w:val="BodyText"/>
       </w:pPr>
       <w:r>
-        <w:t>NVIDIA. TensorRT-LLM Support Matrix. https://nvidia.github.io/TensorRT-LLM/reference/support-matrix.html</w:t>
+        <w:t>Red Hat. vLLM: A high-throughput and memory-efficient inference engine (October 2025).</w:t>
       </w:r>
     </w:p>
     <w:p>
@@ -10195,7 +10484,7 @@
         <w:pStyle w:val="BodyText"/>
       </w:pPr>
       <w:r>
-        <w:t>Patel, P., et al. Splitwise: Efficient generative LLM inference using phase splitting. ISCA (2024).</w:t>
+        <w:t>SkyLB. Locality-aware cross-region load balancer for LLM inference. arXiv:2505.24095 (2025).</w:t>
       </w:r>
     </w:p>
     <w:p>
@@ -10203,7 +10492,7 @@
         <w:pStyle w:val="BodyText"/>
       </w:pPr>
       <w:r>
-        <w:t>Patel, T., et al. Characterizing power management opportunities for LLMs in the cloud. ASPLOS (2024).</w:t>
+        <w:t>Stojkovic, J., et al. DynamoLLM: Designing LLM inference clusters for performance and energy efficiency. HPCA (2025).</w:t>
       </w:r>
     </w:p>
     <w:p>
@@ -10211,7 +10500,7 @@
         <w:pStyle w:val="BodyText"/>
       </w:pPr>
       <w:r>
-        <w:t>PJM Interconnection. Manual 13: Emergency Operations. Rev. 86 (2025).</w:t>
+        <w:t>Tirmazi, M., et al. Borg: The next generation. EuroSys (2020).</w:t>
       </w:r>
     </w:p>
     <w:p>
@@ -10219,7 +10508,7 @@
         <w:pStyle w:val="BodyText"/>
       </w:pPr>
       <w:r>
-        <w:t>Radovanović, A., et al. Carbon-aware computing for datacenters. IEEE Transactions on Power Systems 38(2), 1270–1280 (2022).</w:t>
+        <w:t>Verma, A., et al. Large-scale cluster management at Google with Borg. EuroSys (2015).</w:t>
       </w:r>
     </w:p>
     <w:p>
@@ -10227,7 +10516,23 @@
         <w:pStyle w:val="BodyText"/>
       </w:pPr>
       <w:r>
-        <w:t>Jia, N., et al. SageServe: Optimizing LLM Serving on Cloud Data Centers with Forecast Aware Auto-Scaling. arXiv:2502.14617 (2025).</w:t>
+        <w:t xml:space="preserve">Wang, Y., Chen, Y., Li, Z., Kang, X., Zhao, Y., Ma, Z., Bao, H., Mei, X., Liu, Y., Chen, Y., Zhang, Q., Guo, M., Jin, W., Guo, M., &amp; Cui, H. </w:t>
+      </w:r>
+      <w:proofErr w:type="spellStart"/>
+      <w:r>
+        <w:t>BurstGPT</w:t>
+      </w:r>
+      <w:proofErr w:type="spellEnd"/>
+      <w:r>
+        <w:t>: A Real-World Workload Dataset to Optimize LLM Serving Systems. arXiv:2401.17644v3 (2024). Dataset release: github.com/HPMLL/</w:t>
+      </w:r>
+      <w:proofErr w:type="spellStart"/>
+      <w:r>
+        <w:t>BurstGPT</w:t>
+      </w:r>
+      <w:proofErr w:type="spellEnd"/>
+      <w:r>
+        <w:t>.</w:t>
       </w:r>
     </w:p>
     <w:p>
@@ -10235,56 +10540,16 @@
         <w:pStyle w:val="BodyText"/>
       </w:pPr>
       <w:r>
-        <w:t>Red Hat. vLLM: A high-throughput and memory-efficient inference engine (October 2025).</w:t>
-      </w:r>
-    </w:p>
-    <w:p>
-      <w:pPr>
-        <w:pStyle w:val="BodyText"/>
-      </w:pPr>
-      <w:r>
-        <w:t>SkyLB. Locality-aware cross-region load balancer for LLM inference. arXiv:2505.24095 (2025).</w:t>
-      </w:r>
-    </w:p>
-    <w:p>
-      <w:pPr>
-        <w:pStyle w:val="BodyText"/>
-      </w:pPr>
-      <w:r>
-        <w:t>Stojkovic, J., et al. DynamoLLM: Designing LLM inference clusters for performance and energy efficiency. HPCA (2025).</w:t>
-      </w:r>
-    </w:p>
-    <w:p>
-      <w:pPr>
-        <w:pStyle w:val="BodyText"/>
-      </w:pPr>
-      <w:r>
         <w:lastRenderedPageBreak/>
-        <w:t>Tirmazi, M., et al. Borg: The next generation. EuroSys (2020).</w:t>
-      </w:r>
-    </w:p>
-    <w:p>
-      <w:pPr>
-        <w:pStyle w:val="BodyText"/>
-      </w:pPr>
-      <w:r>
-        <w:t>Verma, A., et al. Large-scale cluster management at Google with Borg. EuroSys (2015).</w:t>
-      </w:r>
-    </w:p>
-    <w:p>
-      <w:pPr>
-        <w:pStyle w:val="BodyText"/>
-      </w:pPr>
-      <w:r>
-        <w:t>Wang, Y., et al. BurstGPT: A real-world workload dataset for large language models. arXiv (2024).</w:t>
-      </w:r>
-    </w:p>
-    <w:p>
-      <w:pPr>
-        <w:pStyle w:val="BodyText"/>
-      </w:pPr>
-      <w:r>
-        <w:t>Zhang, C. Flexible HPC: Workload scheduling for carbon and grid-aware computing. PhD Dissertation, University of Chicago (2022).</w:t>
+        <w:t xml:space="preserve">Zhang, </w:t>
+      </w:r>
+      <w:proofErr w:type="spellStart"/>
+      <w:r>
+        <w:t>Chaojie</w:t>
+      </w:r>
+      <w:proofErr w:type="spellEnd"/>
+      <w:r>
+        <w:t>. Flexible Computing for Sustainable Cloud Data Centers. PhD Dissertation, Department of Computer Science, University of Chicago, 2022. Advisor: Andrew A. Chien. https://knowledge.uchicago.edu/record/5719.</w:t>
       </w:r>
     </w:p>
     <w:p>
@@ -10344,6 +10609,22 @@
     <w:p>
       <w:r>
         <w:continuationSeparator/>
+      </w:r>
+    </w:p>
+  </w:footnote>
+  <w:footnote w:id="1">
+    <w:p>
+      <w:pPr>
+        <w:pStyle w:val="FootnoteText"/>
+      </w:pPr>
+      <w:r>
+        <w:rPr>
+          <w:rStyle w:val="FootnoteReference"/>
+        </w:rPr>
+        <w:footnoteRef/>
+      </w:r>
+      <w:r>
+        <w:t xml:space="preserve"> Azure Public Dataset, DynamoLLM traces, https://github.com/Azure/AzurePublicDataset. The released window includes the seven-day span used in this analysis.</w:t>
       </w:r>
     </w:p>
   </w:footnote>
@@ -11298,7 +11579,6 @@
   <w:style w:type="character" w:default="1" w:styleId="DefaultParagraphFont">
     <w:name w:val="Default Paragraph Font"/>
     <w:uiPriority w:val="1"/>
-    <w:semiHidden/>
     <w:unhideWhenUsed/>
   </w:style>
   <w:style w:type="table" w:default="1" w:styleId="TableNormal">
@@ -11881,6 +12161,18 @@
       <w:sz w:val="22"/>
     </w:rPr>
   </w:style>
+  <w:style w:type="character" w:styleId="UnresolvedMention">
+    <w:name w:val="Unresolved Mention"/>
+    <w:basedOn w:val="DefaultParagraphFont"/>
+    <w:uiPriority w:val="99"/>
+    <w:semiHidden/>
+    <w:unhideWhenUsed/>
+    <w:rsid w:val="007430A6"/>
+    <w:rPr>
+      <w:color w:val="605E5C"/>
+      <w:shd w:val="clear" w:color="auto" w:fill="E1DFDD"/>
+    </w:rPr>
+  </w:style>
 </w:styles>
 </file>
 
@@ -12200,4 +12492,16 @@
   </a:objectDefaults>
   <a:extraClrSchemeLst/>
 </a:theme>
+</file>
+
+<file path=customXml/item1.xml><?xml version="1.0" encoding="utf-8"?>
+<b:Sources xmlns:b="http://schemas.openxmlformats.org/officeDocument/2006/bibliography" xmlns="http://schemas.openxmlformats.org/officeDocument/2006/bibliography" SelectedStyle="\APASixthEditionOfficeOnline.xsl" StyleName="APA" Version="6"/>
+</file>
+
+<file path=customXml/itemProps1.xml><?xml version="1.0" encoding="utf-8"?>
+<ds:datastoreItem xmlns:ds="http://schemas.openxmlformats.org/officeDocument/2006/customXml" ds:itemID="{83412D2F-7BF7-411A-9B2B-DD98909FD2BE}">
+  <ds:schemaRefs>
+    <ds:schemaRef ds:uri="http://schemas.openxmlformats.org/officeDocument/2006/bibliography"/>
+  </ds:schemaRefs>
+</ds:datastoreItem>
 </file>
</xml_diff>